<commit_message>
Ajoute un document des articles du journal, à modifier et renvoyer
Même principe que le document des textes du site : chaque bloc d'article
est précédé d'un code stable entre crochets. Un article s'y lit comme une
fiche (titre, description, date, signature, mots-clés, photo d'en-tête)
suivie de son texte, découpé en intertitres, paragraphes et listes.

- scripts/export-journal.mjs régénère le document depuis src/content
- scripts/lib/document.mjs : la génération du .md et du .docx est
  désormais partagée par les deux exports, qui restent au même format
- contenu/journal-yunma-fr.docx et .md — 3 articles, 60 textes

Co-Authored-By: Claude Opus 5 <noreply@anthropic.com>
Claude-Session: https://claude.ai/code/session_01TdPmDZXduvNbe7E8ZfBSyg
</commit_message>
<xml_diff>
--- a/contenu/textes-yunma-fr.docx
+++ b/contenu/textes-yunma-fr.docx
@@ -7,7 +7,7 @@
         <w:pStyle w:val="Title"/>
       </w:pPr>
       <w:r>
-        <w:t xml:space="preserve">Yunma — textes du site</w:t>
+        <w:t xml:space="preserve">Yunma — textes du site (français)</w:t>
       </w:r>
     </w:p>
     <w:p>
@@ -20,7 +20,7 @@
           <w:iCs/>
           <w:color w:val="666660"/>
         </w:rPr>
-        <w:t xml:space="preserve">Français. Document généré le 03/09/2026. Modifiez les textes sous les codes entre crochets, sans toucher aux codes.</w:t>
+        <w:t xml:space="preserve">Document généré le 03/09/2026 à partir du site. Modifiez les textes sous les codes entre crochets, sans toucher aux codes eux-mêmes.</w:t>
       </w:r>
     </w:p>
     <w:p>

</xml_diff>